<commit_message>
Add AI declaration and usage documentation
</commit_message>
<xml_diff>
--- a/AI usage.docx
+++ b/AI usage.docx
@@ -9,33 +9,895 @@
           <w:bCs/>
         </w:rPr>
       </w:pPr>
+      <w:r>
+        <w:rPr>
+          <w:b/>
+          <w:bCs/>
+        </w:rPr>
+        <w:t>============================================================</w:t>
+      </w:r>
+    </w:p>
+    <w:p>
+      <w:pPr>
+        <w:rPr>
+          <w:b/>
+          <w:bCs/>
+        </w:rPr>
+      </w:pPr>
+      <w:r>
+        <w:rPr>
+          <w:b/>
+          <w:bCs/>
+        </w:rPr>
+        <w:t xml:space="preserve">           AI USAGE DECLARATION</w:t>
+      </w:r>
+    </w:p>
+    <w:p>
+      <w:pPr>
+        <w:rPr>
+          <w:b/>
+          <w:bCs/>
+        </w:rPr>
+      </w:pPr>
+      <w:r>
+        <w:rPr>
+          <w:b/>
+          <w:bCs/>
+        </w:rPr>
+        <w:t>============================================================</w:t>
+      </w:r>
+    </w:p>
+    <w:p>
+      <w:pPr>
+        <w:rPr>
+          <w:b/>
+          <w:bCs/>
+        </w:rPr>
+      </w:pPr>
+    </w:p>
+    <w:p>
+      <w:pPr>
+        <w:rPr>
+          <w:b/>
+          <w:bCs/>
+        </w:rPr>
+      </w:pPr>
+      <w:r>
+        <w:rPr>
+          <w:b/>
+          <w:bCs/>
+        </w:rPr>
+        <w:t>Name: Tahmid Faiyaz</w:t>
+      </w:r>
+    </w:p>
+    <w:p>
+      <w:pPr>
+        <w:rPr>
+          <w:b/>
+          <w:bCs/>
+        </w:rPr>
+      </w:pPr>
+      <w:r>
+        <w:rPr>
+          <w:b/>
+          <w:bCs/>
+        </w:rPr>
+        <w:t>Student ID: 23201212</w:t>
+      </w:r>
+    </w:p>
+    <w:p>
+      <w:pPr>
+        <w:rPr>
+          <w:b/>
+          <w:bCs/>
+        </w:rPr>
+      </w:pPr>
+      <w:r>
+        <w:rPr>
+          <w:b/>
+          <w:bCs/>
+        </w:rPr>
+        <w:t>Assignment:01</w:t>
+      </w:r>
+    </w:p>
+    <w:p>
+      <w:pPr>
+        <w:rPr>
+          <w:b/>
+          <w:bCs/>
+        </w:rPr>
+      </w:pPr>
+      <w:r>
+        <w:rPr>
+          <w:b/>
+          <w:bCs/>
+        </w:rPr>
+        <w:t>Date: 25/10/26</w:t>
+      </w:r>
+    </w:p>
+    <w:p>
+      <w:pPr>
+        <w:rPr>
+          <w:b/>
+          <w:bCs/>
+        </w:rPr>
+      </w:pPr>
+    </w:p>
+    <w:p>
+      <w:pPr>
+        <w:rPr>
+          <w:b/>
+          <w:bCs/>
+        </w:rPr>
+      </w:pPr>
+      <w:r>
+        <w:rPr>
+          <w:b/>
+          <w:bCs/>
+        </w:rPr>
+        <w:t>------------------------------------------------------------</w:t>
+      </w:r>
+    </w:p>
+    <w:p>
+      <w:pPr>
+        <w:rPr>
+          <w:b/>
+          <w:bCs/>
+        </w:rPr>
+      </w:pPr>
+      <w:r>
+        <w:rPr>
+          <w:b/>
+          <w:bCs/>
+        </w:rPr>
+        <w:t>1. AI TOOLS USED (check all that apply)</w:t>
+      </w:r>
+    </w:p>
+    <w:p>
+      <w:pPr>
+        <w:rPr>
+          <w:b/>
+          <w:bCs/>
+        </w:rPr>
+      </w:pPr>
+      <w:r>
+        <w:rPr>
+          <w:b/>
+          <w:bCs/>
+        </w:rPr>
+        <w:t>------------------------------------------------------------</w:t>
+      </w:r>
+    </w:p>
+    <w:p>
+      <w:pPr>
+        <w:rPr>
+          <w:b/>
+          <w:bCs/>
+        </w:rPr>
+      </w:pPr>
+      <w:r>
+        <w:rPr>
+          <w:b/>
+          <w:bCs/>
+        </w:rPr>
+        <w:t>[ ] None</w:t>
+      </w:r>
+    </w:p>
+    <w:p>
+      <w:pPr>
+        <w:rPr>
+          <w:b/>
+          <w:bCs/>
+        </w:rPr>
+      </w:pPr>
+      <w:r>
+        <w:rPr>
+          <w:b/>
+          <w:bCs/>
+        </w:rPr>
+        <w:t>[Yes ] ChatGPT</w:t>
+      </w:r>
+    </w:p>
+    <w:p>
+      <w:pPr>
+        <w:rPr>
+          <w:b/>
+          <w:bCs/>
+        </w:rPr>
+      </w:pPr>
+      <w:r>
+        <w:rPr>
+          <w:b/>
+          <w:bCs/>
+        </w:rPr>
+        <w:t>[ ] GitHub Copilot</w:t>
+      </w:r>
+    </w:p>
+    <w:p>
+      <w:pPr>
+        <w:rPr>
+          <w:b/>
+          <w:bCs/>
+        </w:rPr>
+      </w:pPr>
+      <w:r>
+        <w:rPr>
+          <w:b/>
+          <w:bCs/>
+        </w:rPr>
+        <w:t>[ ] Google Gemini</w:t>
+      </w:r>
+    </w:p>
+    <w:p>
+      <w:pPr>
+        <w:rPr>
+          <w:b/>
+          <w:bCs/>
+        </w:rPr>
+      </w:pPr>
+      <w:r>
+        <w:rPr>
+          <w:b/>
+          <w:bCs/>
+        </w:rPr>
+        <w:t>[ ] Claude</w:t>
+      </w:r>
+    </w:p>
+    <w:p>
+      <w:pPr>
+        <w:rPr>
+          <w:b/>
+          <w:bCs/>
+        </w:rPr>
+      </w:pPr>
+      <w:r>
+        <w:rPr>
+          <w:b/>
+          <w:bCs/>
+        </w:rPr>
+        <w:t>[ ] Cursor</w:t>
+      </w:r>
+    </w:p>
+    <w:p>
+      <w:pPr>
+        <w:rPr>
+          <w:b/>
+          <w:bCs/>
+        </w:rPr>
+      </w:pPr>
+      <w:r>
+        <w:rPr>
+          <w:b/>
+          <w:bCs/>
+        </w:rPr>
+        <w:t>[ ] Other: ________________</w:t>
+      </w:r>
+    </w:p>
+    <w:p>
+      <w:pPr>
+        <w:rPr>
+          <w:b/>
+          <w:bCs/>
+        </w:rPr>
+      </w:pPr>
+    </w:p>
+    <w:p>
+      <w:pPr>
+        <w:rPr>
+          <w:b/>
+          <w:bCs/>
+        </w:rPr>
+      </w:pPr>
+      <w:r>
+        <w:rPr>
+          <w:b/>
+          <w:bCs/>
+        </w:rPr>
+        <w:t>------------------------------------------------------------</w:t>
+      </w:r>
+    </w:p>
+    <w:p>
+      <w:pPr>
+        <w:rPr>
+          <w:b/>
+          <w:bCs/>
+        </w:rPr>
+      </w:pPr>
+      <w:r>
+        <w:rPr>
+          <w:b/>
+          <w:bCs/>
+        </w:rPr>
+        <w:t>2. PURPOSE OF AI USE (check all that apply)</w:t>
+      </w:r>
+    </w:p>
+    <w:p>
+      <w:pPr>
+        <w:rPr>
+          <w:b/>
+          <w:bCs/>
+        </w:rPr>
+      </w:pPr>
+      <w:r>
+        <w:rPr>
+          <w:b/>
+          <w:bCs/>
+        </w:rPr>
+        <w:t>------------------------------------------------------------</w:t>
+      </w:r>
+    </w:p>
+    <w:p>
+      <w:pPr>
+        <w:rPr>
+          <w:b/>
+          <w:bCs/>
+        </w:rPr>
+      </w:pPr>
+      <w:r>
+        <w:rPr>
+          <w:b/>
+          <w:bCs/>
+        </w:rPr>
+        <w:t>[Yes ] Learning/understanding concepts</w:t>
+      </w:r>
+    </w:p>
+    <w:p>
+      <w:pPr>
+        <w:rPr>
+          <w:b/>
+          <w:bCs/>
+        </w:rPr>
+      </w:pPr>
+      <w:r>
+        <w:rPr>
+          <w:b/>
+          <w:bCs/>
+        </w:rPr>
+        <w:t>[Yes ] Debugging my code</w:t>
+      </w:r>
+    </w:p>
+    <w:p>
+      <w:pPr>
+        <w:rPr>
+          <w:b/>
+          <w:bCs/>
+        </w:rPr>
+      </w:pPr>
+      <w:r>
+        <w:rPr>
+          <w:b/>
+          <w:bCs/>
+        </w:rPr>
+        <w:t>[Yes] Generating code snippets</w:t>
+      </w:r>
+    </w:p>
+    <w:p>
+      <w:pPr>
+        <w:rPr>
+          <w:b/>
+          <w:bCs/>
+        </w:rPr>
+      </w:pPr>
+      <w:r>
+        <w:rPr>
+          <w:b/>
+          <w:bCs/>
+        </w:rPr>
+        <w:lastRenderedPageBreak/>
+        <w:t>[ ] Writing text content</w:t>
+      </w:r>
+    </w:p>
+    <w:p>
+      <w:pPr>
+        <w:rPr>
+          <w:b/>
+          <w:bCs/>
+        </w:rPr>
+      </w:pPr>
+      <w:r>
+        <w:rPr>
+          <w:b/>
+          <w:bCs/>
+        </w:rPr>
+        <w:t>[ ] Design/styling ideas</w:t>
+      </w:r>
+    </w:p>
+    <w:p>
+      <w:pPr>
+        <w:rPr>
+          <w:b/>
+          <w:bCs/>
+        </w:rPr>
+      </w:pPr>
+      <w:r>
+        <w:rPr>
+          <w:b/>
+          <w:bCs/>
+        </w:rPr>
+        <w:t>[ ] Image generation</w:t>
+      </w:r>
+    </w:p>
+    <w:p>
+      <w:pPr>
+        <w:rPr>
+          <w:b/>
+          <w:bCs/>
+        </w:rPr>
+      </w:pPr>
+      <w:r>
+        <w:rPr>
+          <w:b/>
+          <w:bCs/>
+        </w:rPr>
+        <w:t>[ ] Other: ________________</w:t>
+      </w:r>
+    </w:p>
+    <w:p>
+      <w:pPr>
+        <w:rPr>
+          <w:b/>
+          <w:bCs/>
+        </w:rPr>
+      </w:pPr>
+    </w:p>
+    <w:p>
+      <w:pPr>
+        <w:rPr>
+          <w:b/>
+          <w:bCs/>
+        </w:rPr>
+      </w:pPr>
+      <w:r>
+        <w:rPr>
+          <w:b/>
+          <w:bCs/>
+        </w:rPr>
+        <w:t>------------------------------------------------------------</w:t>
+      </w:r>
+    </w:p>
+    <w:p>
+      <w:pPr>
+        <w:rPr>
+          <w:b/>
+          <w:bCs/>
+        </w:rPr>
+      </w:pPr>
+      <w:r>
+        <w:rPr>
+          <w:b/>
+          <w:bCs/>
+        </w:rPr>
+        <w:t>3. DESCRIPTION OF AI USE</w:t>
+      </w:r>
+    </w:p>
+    <w:p>
+      <w:pPr>
+        <w:rPr>
+          <w:b/>
+          <w:bCs/>
+        </w:rPr>
+      </w:pPr>
+      <w:r>
+        <w:rPr>
+          <w:b/>
+          <w:bCs/>
+        </w:rPr>
+        <w:t>------------------------------------------------------------</w:t>
+      </w:r>
+    </w:p>
+    <w:p>
+      <w:pPr>
+        <w:rPr>
+          <w:b/>
+          <w:bCs/>
+        </w:rPr>
+      </w:pPr>
+      <w:r>
+        <w:rPr>
+          <w:b/>
+          <w:bCs/>
+        </w:rPr>
+        <w:t>Briefly describe what you used AI for and how:</w:t>
+      </w:r>
+    </w:p>
+    <w:p>
+      <w:pPr>
+        <w:rPr>
+          <w:b/>
+          <w:bCs/>
+        </w:rPr>
+      </w:pPr>
+    </w:p>
+    <w:p>
+      <w:pPr>
+        <w:rPr>
+          <w:b/>
+          <w:bCs/>
+        </w:rPr>
+      </w:pPr>
+      <w:r>
+        <w:rPr>
+          <w:b/>
+          <w:bCs/>
+        </w:rPr>
+        <w:t>I used AI to learn new concepts and implemented those in the assignment.</w:t>
+      </w:r>
+    </w:p>
+    <w:p>
+      <w:pPr>
+        <w:rPr>
+          <w:b/>
+          <w:bCs/>
+        </w:rPr>
+      </w:pPr>
+    </w:p>
+    <w:p>
+      <w:pPr>
+        <w:rPr>
+          <w:b/>
+          <w:bCs/>
+        </w:rPr>
+      </w:pPr>
+    </w:p>
+    <w:p>
+      <w:pPr>
+        <w:rPr>
+          <w:b/>
+          <w:bCs/>
+        </w:rPr>
+      </w:pPr>
+    </w:p>
+    <w:p>
+      <w:pPr>
+        <w:rPr>
+          <w:b/>
+          <w:bCs/>
+        </w:rPr>
+      </w:pPr>
+    </w:p>
+    <w:p>
+      <w:pPr>
+        <w:rPr>
+          <w:b/>
+          <w:bCs/>
+        </w:rPr>
+      </w:pPr>
+      <w:r>
+        <w:rPr>
+          <w:b/>
+          <w:bCs/>
+        </w:rPr>
+        <w:t>------------------------------------------------------------</w:t>
+      </w:r>
+    </w:p>
+    <w:p>
+      <w:pPr>
+        <w:rPr>
+          <w:b/>
+          <w:bCs/>
+        </w:rPr>
+      </w:pPr>
+      <w:r>
+        <w:rPr>
+          <w:b/>
+          <w:bCs/>
+        </w:rPr>
+        <w:t>4. AI-ASSISTED SECTIONS</w:t>
+      </w:r>
+    </w:p>
+    <w:p>
+      <w:pPr>
+        <w:rPr>
+          <w:b/>
+          <w:bCs/>
+        </w:rPr>
+      </w:pPr>
+      <w:r>
+        <w:rPr>
+          <w:b/>
+          <w:bCs/>
+        </w:rPr>
+        <w:t>------------------------------------------------------------</w:t>
+      </w:r>
+    </w:p>
+    <w:p>
+      <w:pPr>
+        <w:rPr>
+          <w:b/>
+          <w:bCs/>
+        </w:rPr>
+      </w:pPr>
+      <w:r>
+        <w:rPr>
+          <w:b/>
+          <w:bCs/>
+        </w:rPr>
+        <w:t>List specific files/sections where AI helped significantly:</w:t>
+      </w:r>
+    </w:p>
+    <w:p>
+      <w:pPr>
+        <w:rPr>
+          <w:b/>
+          <w:bCs/>
+        </w:rPr>
+      </w:pPr>
+    </w:p>
+    <w:p>
+      <w:pPr>
+        <w:rPr>
+          <w:b/>
+          <w:bCs/>
+        </w:rPr>
+      </w:pPr>
+      <w:r>
+        <w:rPr>
+          <w:b/>
+          <w:bCs/>
+        </w:rPr>
+        <w:t>File: _____</w:t>
+      </w:r>
       <w:proofErr w:type="spellStart"/>
       <w:r>
         <w:rPr>
           <w:b/>
           <w:bCs/>
         </w:rPr>
-        <w:t>ChatGpt</w:t>
+        <w:t>MainAcitivity.kt</w:t>
       </w:r>
       <w:proofErr w:type="spellEnd"/>
-    </w:p>
-    <w:p>
-      <w:r>
-        <w:t>Prompts and chat history</w:t>
-      </w:r>
-    </w:p>
-    <w:p>
-      <w:hyperlink r:id="rId4" w:history="1">
-        <w:r>
-          <w:rPr>
-            <w:rStyle w:val="Hyperlink"/>
-          </w:rPr>
-          <w:t>https://chatgpt.com/share/6ad45a1b-c448-83ee-a7c8-b6e9a50e2645</w:t>
-        </w:r>
-      </w:hyperlink>
-    </w:p>
-    <w:p/>
-    <w:p/>
+      <w:r>
+        <w:rPr>
+          <w:b/>
+          <w:bCs/>
+        </w:rPr>
+        <w:t>____________ Section: _________________</w:t>
+      </w:r>
+    </w:p>
+    <w:p>
+      <w:pPr>
+        <w:rPr>
+          <w:b/>
+          <w:bCs/>
+        </w:rPr>
+      </w:pPr>
+      <w:r>
+        <w:rPr>
+          <w:b/>
+          <w:bCs/>
+        </w:rPr>
+        <w:t>File: ________activity_main.xml_________ Section: _________________</w:t>
+      </w:r>
+    </w:p>
+    <w:p>
+      <w:pPr>
+        <w:rPr>
+          <w:b/>
+          <w:bCs/>
+        </w:rPr>
+      </w:pPr>
+      <w:r>
+        <w:rPr>
+          <w:b/>
+          <w:bCs/>
+        </w:rPr>
+        <w:t>File: _________________ Section: _________________</w:t>
+      </w:r>
+    </w:p>
+    <w:p>
+      <w:pPr>
+        <w:rPr>
+          <w:b/>
+          <w:bCs/>
+        </w:rPr>
+      </w:pPr>
+    </w:p>
+    <w:p>
+      <w:pPr>
+        <w:rPr>
+          <w:b/>
+          <w:bCs/>
+        </w:rPr>
+      </w:pPr>
+      <w:r>
+        <w:rPr>
+          <w:b/>
+          <w:bCs/>
+        </w:rPr>
+        <w:t>------------------------------------------------------------</w:t>
+      </w:r>
+    </w:p>
+    <w:p>
+      <w:pPr>
+        <w:rPr>
+          <w:b/>
+          <w:bCs/>
+        </w:rPr>
+      </w:pPr>
+      <w:r>
+        <w:rPr>
+          <w:b/>
+          <w:bCs/>
+        </w:rPr>
+        <w:t>5. DECLARATION</w:t>
+      </w:r>
+    </w:p>
+    <w:p>
+      <w:pPr>
+        <w:rPr>
+          <w:b/>
+          <w:bCs/>
+        </w:rPr>
+      </w:pPr>
+      <w:r>
+        <w:rPr>
+          <w:b/>
+          <w:bCs/>
+        </w:rPr>
+        <w:lastRenderedPageBreak/>
+        <w:t>------------------------------------------------------------</w:t>
+      </w:r>
+    </w:p>
+    <w:p>
+      <w:pPr>
+        <w:rPr>
+          <w:b/>
+          <w:bCs/>
+        </w:rPr>
+      </w:pPr>
+      <w:r>
+        <w:rPr>
+          <w:b/>
+          <w:bCs/>
+        </w:rPr>
+        <w:t>I declare that:</w:t>
+      </w:r>
+    </w:p>
+    <w:p>
+      <w:pPr>
+        <w:rPr>
+          <w:b/>
+          <w:bCs/>
+        </w:rPr>
+      </w:pPr>
+      <w:r>
+        <w:rPr>
+          <w:b/>
+          <w:bCs/>
+        </w:rPr>
+        <w:t>- This disclosure is complete and accurate</w:t>
+      </w:r>
+    </w:p>
+    <w:p>
+      <w:pPr>
+        <w:rPr>
+          <w:b/>
+          <w:bCs/>
+        </w:rPr>
+      </w:pPr>
+      <w:r>
+        <w:rPr>
+          <w:b/>
+          <w:bCs/>
+        </w:rPr>
+        <w:t>- I understand all code in my submission</w:t>
+      </w:r>
+    </w:p>
+    <w:p>
+      <w:pPr>
+        <w:rPr>
+          <w:b/>
+          <w:bCs/>
+        </w:rPr>
+      </w:pPr>
+      <w:r>
+        <w:rPr>
+          <w:b/>
+          <w:bCs/>
+        </w:rPr>
+        <w:t>- I can explain and modify my work if asked</w:t>
+      </w:r>
+    </w:p>
+    <w:p>
+      <w:pPr>
+        <w:rPr>
+          <w:b/>
+          <w:bCs/>
+        </w:rPr>
+      </w:pPr>
+      <w:r>
+        <w:rPr>
+          <w:b/>
+          <w:bCs/>
+        </w:rPr>
+        <w:t>- I take full responsibility for my submission</w:t>
+      </w:r>
+    </w:p>
+    <w:p>
+      <w:pPr>
+        <w:rPr>
+          <w:b/>
+          <w:bCs/>
+        </w:rPr>
+      </w:pPr>
+    </w:p>
+    <w:p>
+      <w:pPr>
+        <w:rPr>
+          <w:b/>
+          <w:bCs/>
+        </w:rPr>
+      </w:pPr>
+      <w:r>
+        <w:rPr>
+          <w:b/>
+          <w:bCs/>
+        </w:rPr>
+        <w:t>Signature: ____________Tahmid Faiyaz___________</w:t>
+      </w:r>
+    </w:p>
+    <w:p>
+      <w:pPr>
+        <w:rPr>
+          <w:b/>
+          <w:bCs/>
+        </w:rPr>
+      </w:pPr>
+      <w:r>
+        <w:rPr>
+          <w:b/>
+          <w:bCs/>
+        </w:rPr>
+        <w:t>Date: ____________25/10/26_______________</w:t>
+      </w:r>
+    </w:p>
+    <w:p>
+      <w:pPr>
+        <w:rPr>
+          <w:b/>
+          <w:bCs/>
+        </w:rPr>
+      </w:pPr>
+    </w:p>
+    <w:p>
+      <w:pPr>
+        <w:rPr>
+          <w:b/>
+          <w:bCs/>
+        </w:rPr>
+      </w:pPr>
+      <w:r>
+        <w:rPr>
+          <w:b/>
+          <w:bCs/>
+        </w:rPr>
+        <w:t>============================================================</w:t>
+      </w:r>
+    </w:p>
+    <w:p>
+      <w:pPr>
+        <w:rPr>
+          <w:b/>
+          <w:bCs/>
+        </w:rPr>
+      </w:pPr>
+      <w:r>
+        <w:rPr>
+          <w:b/>
+          <w:bCs/>
+        </w:rPr>
+        <w:t>Save as: docs/AI_Declaration.txt</w:t>
+      </w:r>
+    </w:p>
+    <w:p>
+      <w:r>
+        <w:rPr>
+          <w:b/>
+          <w:bCs/>
+        </w:rPr>
+        <w:t>============================================================</w:t>
+      </w:r>
+    </w:p>
     <w:sectPr>
       <w:pgSz w:w="12240" w:h="15840"/>
       <w:pgMar w:top="1440" w:right="1440" w:bottom="1440" w:left="1440" w:header="720" w:footer="720" w:gutter="0"/>

</xml_diff>